<commit_message>
agregados cambios a la documentacion y experiment runer
</commit_message>
<xml_diff>
--- a/Documentation/Guía de Creación de Driver De Mensajes.docx
+++ b/Documentation/Guía de Creación de Driver De Mensajes.docx
@@ -1,6 +1,6 @@
 
 <file path=word/document.xml><?xml version="1.0" encoding="utf-8"?>
-<w:document xmlns:wpc="http://schemas.microsoft.com/office/word/2010/wordprocessingCanvas" xmlns:cx="http://schemas.microsoft.com/office/drawing/2014/chartex" xmlns:cx1="http://schemas.microsoft.com/office/drawing/2015/9/8/chartex" xmlns:cx2="http://schemas.microsoft.com/office/drawing/2015/10/21/chartex" xmlns:cx3="http://schemas.microsoft.com/office/drawing/2016/5/9/chartex" xmlns:cx4="http://schemas.microsoft.com/office/drawing/2016/5/10/chartex" xmlns:cx5="http://schemas.microsoft.com/office/drawing/2016/5/11/chartex" xmlns:cx6="http://schemas.microsoft.com/office/drawing/2016/5/12/chartex" xmlns:cx7="http://schemas.microsoft.com/office/drawing/2016/5/13/chartex" xmlns:cx8="http://schemas.microsoft.com/office/drawing/2016/5/14/chartex" xmlns:mc="http://schemas.openxmlformats.org/markup-compatibility/2006" xmlns:aink="http://schemas.microsoft.com/office/drawing/2016/ink" xmlns:am3d="http://schemas.microsoft.com/office/drawing/2017/model3d" xmlns:o="urn:schemas-microsoft-com:office:office" xmlns:r="http://schemas.openxmlformats.org/officeDocument/2006/relationships" xmlns:m="http://schemas.openxmlformats.org/officeDocument/2006/math" xmlns:v="urn:schemas-microsoft-com:vml" xmlns:wp14="http://schemas.microsoft.com/office/word/2010/wordprocessingDrawing" xmlns:wp="http://schemas.openxmlformats.org/drawingml/2006/wordprocessingDrawing" xmlns:w10="urn:schemas-microsoft-com:office:word" xmlns:w="http://schemas.openxmlformats.org/wordprocessingml/2006/main" xmlns:w14="http://schemas.microsoft.com/office/word/2010/wordml" xmlns:w15="http://schemas.microsoft.com/office/word/2012/wordml" xmlns:w16cex="http://schemas.microsoft.com/office/word/2018/wordml/cex" xmlns:w16cid="http://schemas.microsoft.com/office/word/2016/wordml/cid" xmlns:w16="http://schemas.microsoft.com/office/word/2018/wordml" xmlns:w16se="http://schemas.microsoft.com/office/word/2015/wordml/symex" xmlns:wpg="http://schemas.microsoft.com/office/word/2010/wordprocessingGroup" xmlns:wpi="http://schemas.microsoft.com/office/word/2010/wordprocessingInk" xmlns:wne="http://schemas.microsoft.com/office/word/2006/wordml" xmlns:wps="http://schemas.microsoft.com/office/word/2010/wordprocessingShape" mc:Ignorable="w14 w15 w16se w16cid w16 w16cex wp14">
+<w:document xmlns:wpc="http://schemas.microsoft.com/office/word/2010/wordprocessingCanvas" xmlns:cx="http://schemas.microsoft.com/office/drawing/2014/chartex" xmlns:cx1="http://schemas.microsoft.com/office/drawing/2015/9/8/chartex" xmlns:mc="http://schemas.openxmlformats.org/markup-compatibility/2006" xmlns:o="urn:schemas-microsoft-com:office:office" xmlns:r="http://schemas.openxmlformats.org/officeDocument/2006/relationships" xmlns:m="http://schemas.openxmlformats.org/officeDocument/2006/math" xmlns:v="urn:schemas-microsoft-com:vml" xmlns:wp14="http://schemas.microsoft.com/office/word/2010/wordprocessingDrawing" xmlns:wp="http://schemas.openxmlformats.org/drawingml/2006/wordprocessingDrawing" xmlns:w10="urn:schemas-microsoft-com:office:word" xmlns:w="http://schemas.openxmlformats.org/wordprocessingml/2006/main" xmlns:w14="http://schemas.microsoft.com/office/word/2010/wordml" xmlns:w15="http://schemas.microsoft.com/office/word/2012/wordml" xmlns:w16se="http://schemas.microsoft.com/office/word/2015/wordml/symex" xmlns:wpg="http://schemas.microsoft.com/office/word/2010/wordprocessingGroup" xmlns:wpi="http://schemas.microsoft.com/office/word/2010/wordprocessingInk" xmlns:wne="http://schemas.microsoft.com/office/word/2006/wordml" xmlns:wps="http://schemas.microsoft.com/office/word/2010/wordprocessingShape" mc:Ignorable="w14 w15 w16se wp14">
   <w:body>
     <w:p>
       <w:pPr>
@@ -21,50 +21,837 @@
     </w:p>
     <w:p>
       <w:pPr>
+        <w:rPr>
+          <w:lang w:val="es-AR"/>
+        </w:rPr>
+      </w:pPr>
+    </w:p>
+    <w:p>
+      <w:pPr>
+        <w:jc w:val="both"/>
+        <w:rPr>
+          <w:lang w:val="es-AR"/>
+        </w:rPr>
+      </w:pPr>
+      <w:r>
+        <w:rPr>
+          <w:lang w:val="es-AR"/>
+        </w:rPr>
+        <w:t xml:space="preserve">En la librería </w:t>
+      </w:r>
+      <w:proofErr w:type="spellStart"/>
+      <w:r>
+        <w:rPr>
+          <w:lang w:val="es-AR"/>
+        </w:rPr>
+        <w:t>Lantz</w:t>
+      </w:r>
+      <w:proofErr w:type="spellEnd"/>
+      <w:r>
+        <w:rPr>
+          <w:lang w:val="es-AR"/>
+        </w:rPr>
+        <w:t xml:space="preserve"> se pueden crear drivers para dispositivos basados en mensajes. Estos pueden ser mensajes enviado por USB, por TCP/IP, o por puerto serial.</w:t>
+      </w:r>
+    </w:p>
+    <w:p>
+      <w:pPr>
         <w:pStyle w:val="Heading1"/>
-        <w:rPr>
-          <w:lang w:val="es-AR"/>
-        </w:rPr>
-      </w:pPr>
+      </w:pPr>
+      <w:r>
+        <w:t>0. Software Requerido</w:t>
+      </w:r>
+      <w:r>
+        <w:t>:</w:t>
+      </w:r>
+    </w:p>
+    <w:p>
+      <w:pPr>
+        <w:jc w:val="both"/>
+        <w:rPr>
+          <w:lang w:val="es-AR"/>
+        </w:rPr>
+      </w:pPr>
+      <w:r>
+        <w:rPr>
+          <w:lang w:val="es-AR"/>
+        </w:rPr>
+        <w:tab/>
+        <w:t>El software necesario para hacer funcionar estos generalmente es:</w:t>
+      </w:r>
+    </w:p>
+    <w:p>
+      <w:pPr>
+        <w:contextualSpacing/>
+        <w:jc w:val="both"/>
+        <w:rPr>
+          <w:lang w:val="es-AR"/>
+        </w:rPr>
+      </w:pPr>
+      <w:r>
+        <w:rPr>
+          <w:lang w:val="es-AR"/>
+        </w:rPr>
+        <w:t>- Python 3</w:t>
+      </w:r>
+    </w:p>
+    <w:p>
+      <w:pPr>
+        <w:contextualSpacing/>
+        <w:jc w:val="both"/>
+        <w:rPr>
+          <w:lang w:val="es-AR"/>
+        </w:rPr>
+      </w:pPr>
+      <w:r>
+        <w:rPr>
+          <w:lang w:val="es-AR"/>
+        </w:rPr>
+        <w:t xml:space="preserve">- </w:t>
+      </w:r>
+      <w:proofErr w:type="spellStart"/>
+      <w:r>
+        <w:rPr>
+          <w:lang w:val="es-AR"/>
+        </w:rPr>
+        <w:t>Lantz</w:t>
+      </w:r>
+      <w:proofErr w:type="spellEnd"/>
+      <w:r>
+        <w:rPr>
+          <w:lang w:val="es-AR"/>
+        </w:rPr>
+        <w:t xml:space="preserve"> (full)</w:t>
+      </w:r>
+    </w:p>
+    <w:p>
+      <w:pPr>
+        <w:contextualSpacing/>
+        <w:jc w:val="both"/>
+        <w:rPr>
+          <w:lang w:val="es-AR"/>
+        </w:rPr>
+      </w:pPr>
+      <w:r>
+        <w:rPr>
+          <w:lang w:val="es-AR"/>
+        </w:rPr>
+        <w:t>- NI-VISA</w:t>
+      </w:r>
+      <w:r>
+        <w:rPr>
+          <w:lang w:val="es-AR"/>
+        </w:rPr>
+        <w:t>*</w:t>
+      </w:r>
+    </w:p>
+    <w:p>
+      <w:pPr>
+        <w:jc w:val="both"/>
+        <w:rPr>
+          <w:lang w:val="es-AR"/>
+        </w:rPr>
+      </w:pPr>
+      <w:r>
+        <w:rPr>
+          <w:lang w:val="es-AR"/>
+        </w:rPr>
+        <w:t>*</w:t>
+      </w:r>
+      <w:r>
+        <w:rPr>
+          <w:lang w:val="es-AR"/>
+        </w:rPr>
+        <w:t>Una copia de la documentación oficial de NI-VI</w:t>
+      </w:r>
+      <w:r>
+        <w:rPr>
+          <w:lang w:val="es-AR"/>
+        </w:rPr>
+        <w:t xml:space="preserve">SA se encuentra en esta carpeta, en la subcarpeta llamada “NI-VISA </w:t>
+      </w:r>
+      <w:proofErr w:type="spellStart"/>
+      <w:r>
+        <w:rPr>
+          <w:lang w:val="es-AR"/>
+        </w:rPr>
+        <w:t>Documentation</w:t>
+      </w:r>
+      <w:proofErr w:type="spellEnd"/>
+      <w:r>
+        <w:rPr>
+          <w:lang w:val="es-AR"/>
+        </w:rPr>
+        <w:t>”</w:t>
+      </w:r>
     </w:p>
     <w:p>
       <w:pPr>
         <w:pStyle w:val="Heading1"/>
-        <w:rPr>
-          <w:color w:val="auto"/>
-          <w:sz w:val="36"/>
-          <w:szCs w:val="36"/>
-          <w:lang w:val="es-AR"/>
-        </w:rPr>
-      </w:pPr>
-      <w:r>
-        <w:rPr>
-          <w:color w:val="auto"/>
-          <w:sz w:val="36"/>
-          <w:szCs w:val="36"/>
-          <w:lang w:val="es-AR"/>
-        </w:rPr>
+      </w:pPr>
+      <w:r>
         <w:t>1.</w:t>
       </w:r>
       <w:r>
-        <w:rPr>
-          <w:color w:val="auto"/>
-          <w:sz w:val="36"/>
-          <w:szCs w:val="36"/>
-          <w:lang w:val="es-AR"/>
-        </w:rPr>
-        <w:t xml:space="preserve"> Herencia</w:t>
-      </w:r>
-      <w:r>
-        <w:rPr>
-          <w:color w:val="auto"/>
-          <w:sz w:val="36"/>
-          <w:szCs w:val="36"/>
+        <w:t xml:space="preserve"> Herencia:</w:t>
+      </w:r>
+    </w:p>
+    <w:p>
+      <w:pPr>
+        <w:jc w:val="both"/>
+        <w:rPr>
+          <w:lang w:val="es-AR"/>
+        </w:rPr>
+      </w:pPr>
+      <w:r>
+        <w:rPr>
+          <w:lang w:val="es-AR"/>
+        </w:rPr>
+        <w:tab/>
+      </w:r>
+      <w:r>
+        <w:rPr>
+          <w:lang w:val="es-AR"/>
+        </w:rPr>
+        <w:t>Los Drivers que quieren conectarse a través de mensajes tendrían que utilizar de clase base “</w:t>
+      </w:r>
+      <w:proofErr w:type="spellStart"/>
+      <w:r>
+        <w:rPr>
+          <w:lang w:val="es-AR"/>
+        </w:rPr>
+        <w:t>MessageBasedDriver</w:t>
+      </w:r>
+      <w:proofErr w:type="spellEnd"/>
+      <w:r>
+        <w:rPr>
+          <w:lang w:val="es-AR"/>
+        </w:rPr>
+        <w:t xml:space="preserve">”, que ofrece una </w:t>
+      </w:r>
+      <w:r>
+        <w:rPr>
+          <w:lang w:val="es-AR"/>
+        </w:rPr>
+        <w:t>cantidad</w:t>
+      </w:r>
+      <w:r>
+        <w:rPr>
+          <w:lang w:val="es-AR"/>
+        </w:rPr>
+        <w:t xml:space="preserve"> de métodos importantes</w:t>
+      </w:r>
+      <w:r>
+        <w:rPr>
+          <w:lang w:val="es-AR"/>
+        </w:rPr>
+        <w:t xml:space="preserve"> e </w:t>
+      </w:r>
+      <w:proofErr w:type="spellStart"/>
+      <w:r>
+        <w:rPr>
+          <w:lang w:val="es-AR"/>
+        </w:rPr>
+        <w:t>utiles</w:t>
+      </w:r>
+      <w:proofErr w:type="spellEnd"/>
+      <w:r>
+        <w:rPr>
+          <w:lang w:val="es-AR"/>
+        </w:rPr>
+        <w:t xml:space="preserve"> para la conexión.</w:t>
+      </w:r>
+      <w:r>
+        <w:rPr>
+          <w:lang w:val="es-AR"/>
+        </w:rPr>
+        <w:t xml:space="preserve"> </w:t>
+      </w:r>
+    </w:p>
+    <w:p>
+      <w:pPr>
+        <w:jc w:val="both"/>
+        <w:rPr>
+          <w:lang w:val="es-AR"/>
+        </w:rPr>
+      </w:pPr>
+      <w:r>
+        <w:rPr>
+          <w:lang w:val="es-AR"/>
+        </w:rPr>
+        <w:t>Cabecera de la clase:</w:t>
+      </w:r>
+    </w:p>
+    <w:bookmarkStart w:id="0" w:name="_MON_1667203185"/>
+    <w:bookmarkEnd w:id="0"/>
+    <w:p>
+      <w:pPr>
+        <w:jc w:val="both"/>
+        <w:rPr>
+          <w:lang w:val="en-US"/>
+        </w:rPr>
+      </w:pPr>
+      <w:r>
+        <w:rPr>
+          <w:lang w:val="en-US"/>
+        </w:rPr>
+        <w:object w:dxaOrig="10467" w:dyaOrig="1874" w14:anchorId="4029E45E">
+          <v:shapetype id="_x0000_t75" coordsize="21600,21600" o:spt="75" o:preferrelative="t" path="m@4@5l@4@11@9@11@9@5xe" filled="f" stroked="f">
+            <v:stroke joinstyle="miter"/>
+            <v:formulas>
+              <v:f eqn="if lineDrawn pixelLineWidth 0"/>
+              <v:f eqn="sum @0 1 0"/>
+              <v:f eqn="sum 0 0 @1"/>
+              <v:f eqn="prod @2 1 2"/>
+              <v:f eqn="prod @3 21600 pixelWidth"/>
+              <v:f eqn="prod @3 21600 pixelHeight"/>
+              <v:f eqn="sum @0 0 1"/>
+              <v:f eqn="prod @6 1 2"/>
+              <v:f eqn="prod @7 21600 pixelWidth"/>
+              <v:f eqn="sum @8 21600 0"/>
+              <v:f eqn="prod @7 21600 pixelHeight"/>
+              <v:f eqn="sum @10 21600 0"/>
+            </v:formulas>
+            <v:path o:extrusionok="f" gradientshapeok="t" o:connecttype="rect"/>
+            <o:lock v:ext="edit" aspectratio="t"/>
+          </v:shapetype>
+          <v:shape id="_x0000_i1039" type="#_x0000_t75" style="width:523.5pt;height:93.75pt" o:ole="">
+            <v:imagedata r:id="rId4" o:title=""/>
+          </v:shape>
+          <o:OLEObject Type="Embed" ProgID="Word.OpenDocumentText.12" ShapeID="_x0000_i1039" DrawAspect="Content" ObjectID="_1667220441" r:id="rId5"/>
+        </w:object>
+      </w:r>
+    </w:p>
+    <w:p>
+      <w:pPr>
+        <w:ind w:firstLine="720"/>
+        <w:jc w:val="both"/>
+        <w:rPr>
+          <w:lang w:val="es-AR"/>
+        </w:rPr>
+      </w:pPr>
+      <w:r>
+        <w:rPr>
+          <w:lang w:val="es-AR"/>
+        </w:rPr>
+        <w:t>Los métodos de clase “</w:t>
+      </w:r>
+      <w:proofErr w:type="spellStart"/>
+      <w:r>
+        <w:rPr>
+          <w:lang w:val="es-AR"/>
+        </w:rPr>
+        <w:t>via_usb</w:t>
+      </w:r>
+      <w:proofErr w:type="spellEnd"/>
+      <w:r>
+        <w:rPr>
+          <w:lang w:val="es-AR"/>
+        </w:rPr>
+        <w:t>”, “</w:t>
+      </w:r>
+      <w:proofErr w:type="spellStart"/>
+      <w:r>
+        <w:rPr>
+          <w:lang w:val="es-AR"/>
+        </w:rPr>
+        <w:t>via_serial</w:t>
+      </w:r>
+      <w:proofErr w:type="spellEnd"/>
+      <w:r>
+        <w:rPr>
+          <w:lang w:val="es-AR"/>
+        </w:rPr>
+        <w:t>”, “</w:t>
+      </w:r>
+      <w:proofErr w:type="spellStart"/>
+      <w:r>
+        <w:rPr>
+          <w:lang w:val="es-AR"/>
+        </w:rPr>
+        <w:t>via_tcpip</w:t>
+      </w:r>
+      <w:proofErr w:type="spellEnd"/>
+      <w:r>
+        <w:rPr>
+          <w:lang w:val="es-AR"/>
+        </w:rPr>
+        <w:t>” y “</w:t>
+      </w:r>
+      <w:proofErr w:type="spellStart"/>
+      <w:r>
+        <w:rPr>
+          <w:lang w:val="es-AR"/>
+        </w:rPr>
+        <w:t>via_gpib</w:t>
+      </w:r>
+      <w:proofErr w:type="spellEnd"/>
+      <w:r>
+        <w:rPr>
+          <w:lang w:val="es-AR"/>
+        </w:rPr>
+        <w:t>” son los métodos que permiten crear un driver con el tipo de conexión indicado. Estos métodos toman como parámetro generalmente la dirección donde se encuentra el dispositivo. TCP IP, por ejemplo, toma el IP y el puerto del dispositivo.</w:t>
+      </w:r>
+    </w:p>
+    <w:p>
+      <w:pPr>
+        <w:jc w:val="both"/>
+        <w:rPr>
+          <w:lang w:val="es-AR"/>
+        </w:rPr>
+      </w:pPr>
+      <w:r>
+        <w:rPr>
+          <w:lang w:val="es-AR"/>
+        </w:rPr>
+        <w:t>Ej. de uso:</w:t>
+      </w:r>
+    </w:p>
+    <w:bookmarkStart w:id="1" w:name="_MON_1667203292"/>
+    <w:bookmarkEnd w:id="1"/>
+    <w:p>
+      <w:pPr>
+        <w:jc w:val="both"/>
+        <w:rPr>
+          <w:lang w:val="es-AR"/>
+        </w:rPr>
+      </w:pPr>
+      <w:r>
+        <w:rPr>
+          <w:lang w:val="es-AR"/>
+        </w:rPr>
+        <w:object w:dxaOrig="10467" w:dyaOrig="468" w14:anchorId="468E6CC4">
+          <v:shape id="_x0000_i1037" type="#_x0000_t75" style="width:523.5pt;height:23.25pt" o:ole="">
+            <v:imagedata r:id="rId6" o:title=""/>
+          </v:shape>
+          <o:OLEObject Type="Embed" ProgID="Word.OpenDocumentText.12" ShapeID="_x0000_i1037" DrawAspect="Content" ObjectID="_1667220442" r:id="rId7"/>
+        </w:object>
+      </w:r>
+    </w:p>
+    <w:p>
+      <w:pPr>
+        <w:jc w:val="both"/>
+        <w:rPr>
+          <w:lang w:val="es-AR"/>
+        </w:rPr>
+      </w:pPr>
+      <w:r>
+        <w:rPr>
+          <w:lang w:val="es-AR"/>
+        </w:rPr>
+        <w:tab/>
+        <w:t xml:space="preserve">El </w:t>
+      </w:r>
+      <w:r>
+        <w:rPr>
+          <w:lang w:val="es-AR"/>
+        </w:rPr>
+        <w:t>método para inicializar el driver es el segundo “</w:t>
+      </w:r>
+      <w:proofErr w:type="spellStart"/>
+      <w:proofErr w:type="gramStart"/>
+      <w:r>
+        <w:rPr>
+          <w:lang w:val="es-AR"/>
+        </w:rPr>
+        <w:t>initialize</w:t>
+      </w:r>
+      <w:proofErr w:type="spellEnd"/>
+      <w:r>
+        <w:rPr>
+          <w:lang w:val="es-AR"/>
+        </w:rPr>
+        <w:t>(</w:t>
+      </w:r>
+      <w:proofErr w:type="gramEnd"/>
+      <w:r>
+        <w:rPr>
+          <w:lang w:val="es-AR"/>
+        </w:rPr>
+        <w:t>)</w:t>
+      </w:r>
+      <w:r>
+        <w:rPr>
+          <w:lang w:val="es-AR"/>
+        </w:rPr>
+        <w:t>” esto asegura que se conecte correctamente el driver al dispositivo y avisa si hay algún problema en la conexión.</w:t>
+      </w:r>
+    </w:p>
+    <w:p>
+      <w:pPr>
+        <w:pStyle w:val="Heading1"/>
+      </w:pPr>
+      <w:r>
+        <w:t xml:space="preserve">2. </w:t>
+      </w:r>
+      <w:r>
+        <w:t>Enviar</w:t>
+      </w:r>
+      <w:r>
+        <w:t xml:space="preserve"> Mensajes:</w:t>
+      </w:r>
+    </w:p>
+    <w:p>
+      <w:pPr>
+        <w:jc w:val="both"/>
+        <w:rPr>
+          <w:lang w:val="es-AR"/>
+        </w:rPr>
+      </w:pPr>
+      <w:r>
+        <w:rPr>
+          <w:lang w:val="es-AR"/>
+        </w:rPr>
+        <w:tab/>
+      </w:r>
+      <w:r>
+        <w:rPr>
+          <w:lang w:val="es-AR"/>
+        </w:rPr>
+        <w:t>El envió de mensajes se hace a traces del método “</w:t>
+      </w:r>
+      <w:proofErr w:type="spellStart"/>
+      <w:r>
+        <w:rPr>
+          <w:lang w:val="es-AR"/>
+        </w:rPr>
+        <w:t>write</w:t>
+      </w:r>
+      <w:proofErr w:type="spellEnd"/>
+      <w:r>
+        <w:rPr>
+          <w:lang w:val="es-AR"/>
+        </w:rPr>
+        <w:t>” presente en la clase. Este método es</w:t>
+      </w:r>
+      <w:r>
+        <w:rPr>
+          <w:lang w:val="es-AR"/>
+        </w:rPr>
+        <w:t>cribe el mensaje en el canal de</w:t>
+      </w:r>
+      <w:r>
+        <w:rPr>
+          <w:lang w:val="es-AR"/>
+        </w:rPr>
+        <w:t xml:space="preserve"> </w:t>
+      </w:r>
+      <w:r>
+        <w:rPr>
+          <w:lang w:val="es-AR"/>
+        </w:rPr>
+        <w:t xml:space="preserve">comunicación con el driver, y devuelve la cantidad de bytes que se escribieron. Esto se usaría en los casos donde es necesario solo escribir algo y no importa la respuesta. </w:t>
+      </w:r>
+    </w:p>
+    <w:p>
+      <w:pPr>
+        <w:jc w:val="both"/>
+        <w:rPr>
+          <w:lang w:val="es-AR"/>
+        </w:rPr>
+      </w:pPr>
+      <w:r>
+        <w:rPr>
+          <w:lang w:val="es-AR"/>
+        </w:rPr>
+        <w:t>Ejemplo de uso en el driver sdg5122:</w:t>
+      </w:r>
+    </w:p>
+    <w:bookmarkStart w:id="2" w:name="_MON_1667207691"/>
+    <w:bookmarkEnd w:id="2"/>
+    <w:p>
+      <w:pPr>
+        <w:jc w:val="both"/>
+        <w:rPr>
+          <w:lang w:val="es-AR"/>
+        </w:rPr>
+      </w:pPr>
+      <w:r>
+        <w:rPr>
+          <w:lang w:val="es-AR"/>
+        </w:rPr>
+        <w:object w:dxaOrig="10467" w:dyaOrig="1874" w14:anchorId="6726DEF1">
+          <v:shape id="_x0000_i1041" type="#_x0000_t75" style="width:523.5pt;height:93.75pt" o:ole="">
+            <v:imagedata r:id="rId8" o:title=""/>
+          </v:shape>
+          <o:OLEObject Type="Embed" ProgID="Word.OpenDocumentText.12" ShapeID="_x0000_i1041" DrawAspect="Content" ObjectID="_1667220443" r:id="rId9"/>
+        </w:object>
+      </w:r>
+    </w:p>
+    <w:p>
+      <w:pPr>
+        <w:pStyle w:val="Heading1"/>
+      </w:pPr>
+      <w:r>
+        <w:lastRenderedPageBreak/>
+        <w:t>3. Recibir Mensajes:</w:t>
+      </w:r>
+    </w:p>
+    <w:p>
+      <w:pPr>
+        <w:jc w:val="both"/>
+        <w:rPr>
+          <w:lang w:val="es-AR"/>
+        </w:rPr>
+      </w:pPr>
+      <w:r>
+        <w:rPr>
+          <w:lang w:val="es-AR"/>
+        </w:rPr>
+        <w:tab/>
+      </w:r>
+      <w:proofErr w:type="spellStart"/>
+      <w:r>
+        <w:rPr>
+          <w:lang w:val="es-AR"/>
+        </w:rPr>
+        <w:t>El</w:t>
+      </w:r>
+      <w:proofErr w:type="spellEnd"/>
+      <w:r>
+        <w:rPr>
+          <w:lang w:val="es-AR"/>
+        </w:rPr>
+        <w:t xml:space="preserve"> </w:t>
+      </w:r>
+      <w:r>
+        <w:rPr>
+          <w:lang w:val="es-AR"/>
+        </w:rPr>
+        <w:t>envió</w:t>
+      </w:r>
+      <w:r>
+        <w:rPr>
+          <w:lang w:val="es-AR"/>
+        </w:rPr>
+        <w:t xml:space="preserve"> de mensajes</w:t>
+      </w:r>
+      <w:r>
+        <w:rPr>
+          <w:lang w:val="es-AR"/>
+        </w:rPr>
+        <w:t xml:space="preserve"> se hace a través del método “</w:t>
+      </w:r>
+      <w:proofErr w:type="spellStart"/>
+      <w:r>
+        <w:rPr>
+          <w:lang w:val="es-AR"/>
+        </w:rPr>
+        <w:t>read</w:t>
+      </w:r>
+      <w:proofErr w:type="spellEnd"/>
+      <w:r>
+        <w:rPr>
+          <w:lang w:val="es-AR"/>
+        </w:rPr>
+        <w:t>”. Este método lee el buffer hasta el punto</w:t>
+      </w:r>
+      <w:r>
+        <w:rPr>
+          <w:lang w:val="es-AR"/>
+        </w:rPr>
+        <w:t xml:space="preserve"> de leer el byte de finalizacion</w:t>
+      </w:r>
+      <w:r>
+        <w:rPr>
+          <w:vertAlign w:val="superscript"/>
+          <w:lang w:val="es-AR"/>
+        </w:rPr>
+        <w:t>1</w:t>
+      </w:r>
+      <w:r>
+        <w:rPr>
+          <w:lang w:val="es-AR"/>
+        </w:rPr>
+        <w:t xml:space="preserve">. Este método se usa en casos donde hay un mensaje que </w:t>
+      </w:r>
+      <w:proofErr w:type="spellStart"/>
+      <w:r>
+        <w:rPr>
+          <w:lang w:val="es-AR"/>
+        </w:rPr>
+        <w:t>esta</w:t>
+      </w:r>
+      <w:proofErr w:type="spellEnd"/>
+      <w:r>
+        <w:rPr>
+          <w:lang w:val="es-AR"/>
+        </w:rPr>
+        <w:t xml:space="preserve"> esperando en la cola del dispositivo.</w:t>
+      </w:r>
+      <w:r>
+        <w:rPr>
+          <w:lang w:val="es-AR"/>
+        </w:rPr>
+        <w:t xml:space="preserve"> En general esto es útil después de escribir un mensaje que hace al dispositivo escribir una respuesta.</w:t>
+      </w:r>
+      <w:r>
+        <w:rPr>
+          <w:lang w:val="es-AR"/>
+        </w:rPr>
+        <w:t xml:space="preserve"> Este método es usado en el método “</w:t>
+      </w:r>
+      <w:proofErr w:type="spellStart"/>
+      <w:r>
+        <w:rPr>
+          <w:lang w:val="es-AR"/>
+        </w:rPr>
+        <w:t>query</w:t>
+      </w:r>
+      <w:proofErr w:type="spellEnd"/>
+      <w:r>
+        <w:rPr>
+          <w:lang w:val="es-AR"/>
+        </w:rPr>
+        <w:t>”, que primero hace un “</w:t>
+      </w:r>
+      <w:proofErr w:type="spellStart"/>
+      <w:r>
+        <w:rPr>
+          <w:lang w:val="es-AR"/>
+        </w:rPr>
+        <w:t>write</w:t>
+      </w:r>
+      <w:proofErr w:type="spellEnd"/>
+      <w:r>
+        <w:rPr>
+          <w:lang w:val="es-AR"/>
+        </w:rPr>
+        <w:t>” y después lee la respuesta.</w:t>
+      </w:r>
+    </w:p>
+    <w:p>
+      <w:pPr>
+        <w:jc w:val="both"/>
+        <w:rPr>
+          <w:lang w:val="es-AR"/>
+        </w:rPr>
+      </w:pPr>
+      <w:r>
+        <w:rPr>
+          <w:lang w:val="es-AR"/>
+        </w:rPr>
+        <w:t>Código de “</w:t>
+      </w:r>
+      <w:proofErr w:type="spellStart"/>
+      <w:r>
+        <w:rPr>
+          <w:lang w:val="es-AR"/>
+        </w:rPr>
+        <w:t>query</w:t>
+      </w:r>
+      <w:proofErr w:type="spellEnd"/>
+      <w:r>
+        <w:rPr>
+          <w:lang w:val="es-AR"/>
+        </w:rPr>
+        <w:t xml:space="preserve">” en la librería </w:t>
+      </w:r>
+      <w:proofErr w:type="spellStart"/>
+      <w:r>
+        <w:rPr>
+          <w:lang w:val="es-AR"/>
+        </w:rPr>
+        <w:t>Lantz</w:t>
+      </w:r>
+      <w:proofErr w:type="spellEnd"/>
+      <w:r>
+        <w:rPr>
           <w:lang w:val="es-AR"/>
         </w:rPr>
         <w:t>:</w:t>
       </w:r>
     </w:p>
+    <w:bookmarkStart w:id="3" w:name="_MON_1667215174"/>
+    <w:bookmarkEnd w:id="3"/>
+    <w:p>
+      <w:pPr>
+        <w:jc w:val="both"/>
+        <w:rPr>
+          <w:lang w:val="es-AR"/>
+        </w:rPr>
+      </w:pPr>
+      <w:r>
+        <w:rPr>
+          <w:lang w:val="es-AR"/>
+        </w:rPr>
+        <w:object w:dxaOrig="10467" w:dyaOrig="3513" w14:anchorId="485F854E">
+          <v:shape id="_x0000_i1044" type="#_x0000_t75" style="width:523.5pt;height:175.5pt" o:ole="">
+            <v:imagedata r:id="rId10" o:title=""/>
+          </v:shape>
+          <o:OLEObject Type="Embed" ProgID="Word.OpenDocumentText.12" ShapeID="_x0000_i1044" DrawAspect="Content" ObjectID="_1667220444" r:id="rId11"/>
+        </w:object>
+      </w:r>
+    </w:p>
+    <w:p>
+      <w:pPr>
+        <w:jc w:val="both"/>
+        <w:rPr>
+          <w:lang w:val="es-AR"/>
+        </w:rPr>
+      </w:pPr>
+      <w:r>
+        <w:rPr>
+          <w:lang w:val="es-AR"/>
+        </w:rPr>
+        <w:t xml:space="preserve">Ejemplo de uso del </w:t>
+      </w:r>
+      <w:r>
+        <w:rPr>
+          <w:lang w:val="es-AR"/>
+        </w:rPr>
+        <w:t>“</w:t>
+      </w:r>
+      <w:proofErr w:type="spellStart"/>
+      <w:r>
+        <w:rPr>
+          <w:lang w:val="es-AR"/>
+        </w:rPr>
+        <w:t>query</w:t>
+      </w:r>
+      <w:proofErr w:type="spellEnd"/>
+      <w:r>
+        <w:rPr>
+          <w:lang w:val="es-AR"/>
+        </w:rPr>
+        <w:t>”</w:t>
+      </w:r>
+      <w:r>
+        <w:rPr>
+          <w:lang w:val="es-AR"/>
+        </w:rPr>
+        <w:t xml:space="preserve"> para leer una entrada:</w:t>
+      </w:r>
+    </w:p>
+    <w:bookmarkStart w:id="4" w:name="_MON_1667219266"/>
+    <w:bookmarkEnd w:id="4"/>
+    <w:p>
+      <w:pPr>
+        <w:jc w:val="both"/>
+        <w:rPr>
+          <w:lang w:val="en-US"/>
+        </w:rPr>
+      </w:pPr>
+      <w:r>
+        <w:rPr>
+          <w:lang w:val="en-US"/>
+        </w:rPr>
+        <w:object w:dxaOrig="10467" w:dyaOrig="2140" w14:anchorId="36C95C51">
+          <v:shape id="_x0000_i1047" type="#_x0000_t75" style="width:523.5pt;height:107.25pt" o:ole="">
+            <v:imagedata r:id="rId12" o:title=""/>
+          </v:shape>
+          <o:OLEObject Type="Embed" ProgID="Word.OpenDocumentText.12" ShapeID="_x0000_i1047" DrawAspect="Content" ObjectID="_1667220445" r:id="rId13"/>
+        </w:object>
+      </w:r>
+    </w:p>
+    <w:p>
+      <w:pPr>
+        <w:pStyle w:val="Heading1"/>
+      </w:pPr>
+      <w:r>
+        <w:t>Apéndice:</w:t>
+      </w:r>
+    </w:p>
     <w:p>
       <w:pPr>
         <w:rPr>
@@ -76,7 +863,44 @@
           <w:lang w:val="es-AR"/>
         </w:rPr>
         <w:tab/>
-      </w:r>
+        <w:t>Caracteres de terminación: la librería tiene un mecanismo para incluir diferentes caracteres de terminación. Por ejemplo, el generador de funciones SDG</w:t>
+      </w:r>
+      <w:proofErr w:type="gramStart"/>
+      <w:r>
+        <w:rPr>
+          <w:lang w:val="es-AR"/>
+        </w:rPr>
+        <w:t>5122  usa</w:t>
+      </w:r>
+      <w:proofErr w:type="gramEnd"/>
+      <w:r>
+        <w:rPr>
+          <w:lang w:val="es-AR"/>
+        </w:rPr>
+        <w:t xml:space="preserve"> el formato SCPI de comandos, que especifica usar el carácter “new line” como terminación. Esto se puede definir en la clase de la siguiente manera:</w:t>
+      </w:r>
+    </w:p>
+    <w:bookmarkStart w:id="5" w:name="_GoBack"/>
+    <w:bookmarkStart w:id="6" w:name="_MON_1667220174"/>
+    <w:bookmarkEnd w:id="6"/>
+    <w:p>
+      <w:pPr>
+        <w:rPr>
+          <w:lang w:val="en-US"/>
+        </w:rPr>
+      </w:pPr>
+      <w:r>
+        <w:rPr>
+          <w:lang w:val="en-US"/>
+        </w:rPr>
+        <w:object w:dxaOrig="10467" w:dyaOrig="2810" w14:anchorId="671540DE">
+          <v:shape id="_x0000_i1054" type="#_x0000_t75" style="width:523.5pt;height:140.25pt" o:ole="">
+            <v:imagedata r:id="rId14" o:title=""/>
+          </v:shape>
+          <o:OLEObject Type="Embed" ProgID="Word.OpenDocumentText.12" ShapeID="_x0000_i1054" DrawAspect="Content" ObjectID="_1667220446" r:id="rId15"/>
+        </w:object>
+      </w:r>
+      <w:bookmarkEnd w:id="5"/>
     </w:p>
     <w:sectPr>
       <w:pgSz w:w="11907" w:h="16840" w:code="9"/>
@@ -89,7 +913,7 @@
 </file>
 
 <file path=word/styles.xml><?xml version="1.0" encoding="utf-8"?>
-<w:styles xmlns:mc="http://schemas.openxmlformats.org/markup-compatibility/2006" xmlns:r="http://schemas.openxmlformats.org/officeDocument/2006/relationships" xmlns:w="http://schemas.openxmlformats.org/wordprocessingml/2006/main" xmlns:w14="http://schemas.microsoft.com/office/word/2010/wordml" xmlns:w15="http://schemas.microsoft.com/office/word/2012/wordml" xmlns:w16cex="http://schemas.microsoft.com/office/word/2018/wordml/cex" xmlns:w16cid="http://schemas.microsoft.com/office/word/2016/wordml/cid" xmlns:w16="http://schemas.microsoft.com/office/word/2018/wordml" xmlns:w16se="http://schemas.microsoft.com/office/word/2015/wordml/symex" mc:Ignorable="w14 w15 w16se w16cid w16 w16cex">
+<w:styles xmlns:mc="http://schemas.openxmlformats.org/markup-compatibility/2006" xmlns:r="http://schemas.openxmlformats.org/officeDocument/2006/relationships" xmlns:w="http://schemas.openxmlformats.org/wordprocessingml/2006/main" xmlns:w14="http://schemas.microsoft.com/office/word/2010/wordml" xmlns:w15="http://schemas.microsoft.com/office/word/2012/wordml" xmlns:w16se="http://schemas.microsoft.com/office/word/2015/wordml/symex" mc:Ignorable="w14 w15 w16se">
   <w:docDefaults>
     <w:rPrDefault>
       <w:rPr>
@@ -105,7 +929,7 @@
       </w:pPr>
     </w:pPrDefault>
   </w:docDefaults>
-  <w:latentStyles w:defLockedState="0" w:defUIPriority="99" w:defSemiHidden="0" w:defUnhideWhenUsed="0" w:defQFormat="0" w:count="376">
+  <w:latentStyles w:defLockedState="0" w:defUIPriority="99" w:defSemiHidden="0" w:defUnhideWhenUsed="0" w:defQFormat="0" w:count="371">
     <w:lsdException w:name="Normal" w:uiPriority="0" w:qFormat="1"/>
     <w:lsdException w:name="heading 1" w:uiPriority="9" w:qFormat="1"/>
     <w:lsdException w:name="heading 2" w:semiHidden="1" w:uiPriority="9" w:unhideWhenUsed="1" w:qFormat="1"/>
@@ -477,11 +1301,6 @@
     <w:lsdException w:name="List Table 5 Dark Accent 6" w:uiPriority="50"/>
     <w:lsdException w:name="List Table 6 Colorful Accent 6" w:uiPriority="51"/>
     <w:lsdException w:name="List Table 7 Colorful Accent 6" w:uiPriority="52"/>
-    <w:lsdException w:name="Mention" w:semiHidden="1" w:unhideWhenUsed="1"/>
-    <w:lsdException w:name="Smart Hyperlink" w:semiHidden="1" w:unhideWhenUsed="1"/>
-    <w:lsdException w:name="Hashtag" w:semiHidden="1" w:unhideWhenUsed="1"/>
-    <w:lsdException w:name="Unresolved Mention" w:semiHidden="1" w:unhideWhenUsed="1"/>
-    <w:lsdException w:name="Smart Link" w:semiHidden="1" w:unhideWhenUsed="1"/>
   </w:latentStyles>
   <w:style w:type="paragraph" w:default="1" w:styleId="Normal">
     <w:name w:val="Normal"/>
@@ -494,18 +1313,20 @@
     <w:link w:val="Heading1Char"/>
     <w:uiPriority w:val="9"/>
     <w:qFormat/>
-    <w:rsid w:val="001B5340"/>
+    <w:rsid w:val="00C1376F"/>
     <w:pPr>
       <w:keepNext/>
       <w:keepLines/>
       <w:spacing w:before="240" w:after="0"/>
+      <w:jc w:val="both"/>
       <w:outlineLvl w:val="0"/>
     </w:pPr>
     <w:rPr>
       <w:rFonts w:asciiTheme="majorHAnsi" w:eastAsiaTheme="majorEastAsia" w:hAnsiTheme="majorHAnsi" w:cstheme="majorBidi"/>
-      <w:color w:val="2F5496" w:themeColor="accent1" w:themeShade="BF"/>
-      <w:sz w:val="32"/>
-      <w:szCs w:val="32"/>
+      <w:sz w:val="36"/>
+      <w:szCs w:val="36"/>
+      <w:u w:val="single"/>
+      <w:lang w:val="es-AR"/>
     </w:rPr>
   </w:style>
   <w:style w:type="character" w:default="1" w:styleId="DefaultParagraphFont">
@@ -574,12 +1395,13 @@
     <w:basedOn w:val="DefaultParagraphFont"/>
     <w:link w:val="Heading1"/>
     <w:uiPriority w:val="9"/>
-    <w:rsid w:val="001B5340"/>
+    <w:rsid w:val="00C1376F"/>
     <w:rPr>
       <w:rFonts w:asciiTheme="majorHAnsi" w:eastAsiaTheme="majorEastAsia" w:hAnsiTheme="majorHAnsi" w:cstheme="majorBidi"/>
-      <w:color w:val="2F5496" w:themeColor="accent1" w:themeShade="BF"/>
-      <w:sz w:val="32"/>
-      <w:szCs w:val="32"/>
+      <w:sz w:val="36"/>
+      <w:szCs w:val="36"/>
+      <w:u w:val="single"/>
+      <w:lang w:val="es-AR"/>
     </w:rPr>
   </w:style>
 </w:styles>

</xml_diff>

<commit_message>
commit removiendo el idea de git ignore
</commit_message>
<xml_diff>
--- a/Documentation/Guía de Creación de Driver De Mensajes.docx
+++ b/Documentation/Guía de Creación de Driver De Mensajes.docx
@@ -37,21 +37,7 @@
         <w:rPr>
           <w:lang w:val="es-AR"/>
         </w:rPr>
-        <w:t xml:space="preserve">En la librería </w:t>
-      </w:r>
-      <w:proofErr w:type="spellStart"/>
-      <w:r>
-        <w:rPr>
-          <w:lang w:val="es-AR"/>
-        </w:rPr>
-        <w:t>Lantz</w:t>
-      </w:r>
-      <w:proofErr w:type="spellEnd"/>
-      <w:r>
-        <w:rPr>
-          <w:lang w:val="es-AR"/>
-        </w:rPr>
-        <w:t xml:space="preserve"> se pueden crear drivers para dispositivos basados en mensajes. Estos pueden ser mensajes enviado por USB, por TCP/IP, o por puerto serial.</w:t>
+        <w:t>En la librería Lantz se pueden crear drivers para dispositivos basados en mensajes. Estos pueden ser mensajes enviado por USB, por TCP/IP, o por puerto serial.</w:t>
       </w:r>
     </w:p>
     <w:p>
@@ -107,126 +93,112 @@
         <w:rPr>
           <w:lang w:val="es-AR"/>
         </w:rPr>
-        <w:t xml:space="preserve">- </w:t>
+        <w:t>- Lantz (full)</w:t>
+      </w:r>
+    </w:p>
+    <w:p>
+      <w:pPr>
+        <w:contextualSpacing/>
+        <w:jc w:val="both"/>
+        <w:rPr>
+          <w:lang w:val="es-AR"/>
+        </w:rPr>
+      </w:pPr>
+      <w:r>
+        <w:rPr>
+          <w:lang w:val="es-AR"/>
+        </w:rPr>
+        <w:t>- NI-VISA</w:t>
+      </w:r>
+      <w:r>
+        <w:rPr>
+          <w:lang w:val="es-AR"/>
+        </w:rPr>
+        <w:t>*</w:t>
+      </w:r>
+    </w:p>
+    <w:p>
+      <w:pPr>
+        <w:jc w:val="both"/>
+        <w:rPr>
+          <w:lang w:val="es-AR"/>
+        </w:rPr>
+      </w:pPr>
+      <w:r>
+        <w:rPr>
+          <w:lang w:val="es-AR"/>
+        </w:rPr>
+        <w:t>*</w:t>
+      </w:r>
+      <w:r>
+        <w:rPr>
+          <w:lang w:val="es-AR"/>
+        </w:rPr>
+        <w:t>Una copia de la documentación oficial de NI-VI</w:t>
+      </w:r>
+      <w:r>
+        <w:rPr>
+          <w:lang w:val="es-AR"/>
+        </w:rPr>
+        <w:t xml:space="preserve">SA se encuentra en esta carpeta, en la subcarpeta llamada “NI-VISA </w:t>
       </w:r>
       <w:proofErr w:type="spellStart"/>
       <w:r>
         <w:rPr>
           <w:lang w:val="es-AR"/>
         </w:rPr>
-        <w:t>Lantz</w:t>
+        <w:t>Documentation</w:t>
       </w:r>
       <w:proofErr w:type="spellEnd"/>
       <w:r>
         <w:rPr>
           <w:lang w:val="es-AR"/>
         </w:rPr>
-        <w:t xml:space="preserve"> (full)</w:t>
-      </w:r>
-    </w:p>
-    <w:p>
-      <w:pPr>
-        <w:contextualSpacing/>
-        <w:jc w:val="both"/>
-        <w:rPr>
-          <w:lang w:val="es-AR"/>
-        </w:rPr>
-      </w:pPr>
-      <w:r>
-        <w:rPr>
-          <w:lang w:val="es-AR"/>
-        </w:rPr>
-        <w:t>- NI-VISA</w:t>
-      </w:r>
-      <w:r>
-        <w:rPr>
-          <w:lang w:val="es-AR"/>
-        </w:rPr>
-        <w:t>*</w:t>
-      </w:r>
-    </w:p>
-    <w:p>
-      <w:pPr>
-        <w:jc w:val="both"/>
-        <w:rPr>
-          <w:lang w:val="es-AR"/>
-        </w:rPr>
-      </w:pPr>
-      <w:r>
-        <w:rPr>
-          <w:lang w:val="es-AR"/>
-        </w:rPr>
-        <w:t>*</w:t>
-      </w:r>
-      <w:r>
-        <w:rPr>
-          <w:lang w:val="es-AR"/>
-        </w:rPr>
-        <w:t>Una copia de la documentación oficial de NI-VI</w:t>
-      </w:r>
-      <w:r>
-        <w:rPr>
-          <w:lang w:val="es-AR"/>
-        </w:rPr>
-        <w:t xml:space="preserve">SA se encuentra en esta carpeta, en la subcarpeta llamada “NI-VISA </w:t>
+        <w:t>”</w:t>
+      </w:r>
+    </w:p>
+    <w:p>
+      <w:pPr>
+        <w:pStyle w:val="Heading1"/>
+      </w:pPr>
+      <w:r>
+        <w:t>1.</w:t>
+      </w:r>
+      <w:r>
+        <w:t xml:space="preserve"> Herencia:</w:t>
+      </w:r>
+    </w:p>
+    <w:p>
+      <w:pPr>
+        <w:jc w:val="both"/>
+        <w:rPr>
+          <w:lang w:val="es-AR"/>
+        </w:rPr>
+      </w:pPr>
+      <w:r>
+        <w:rPr>
+          <w:lang w:val="es-AR"/>
+        </w:rPr>
+        <w:tab/>
+      </w:r>
+      <w:r>
+        <w:rPr>
+          <w:lang w:val="es-AR"/>
+        </w:rPr>
+        <w:t>Los Drivers que quieren conectarse a través de mensajes tendrían que utilizar de clase base “</w:t>
       </w:r>
       <w:proofErr w:type="spellStart"/>
       <w:r>
         <w:rPr>
           <w:lang w:val="es-AR"/>
         </w:rPr>
-        <w:t>Documentation</w:t>
+        <w:t>MessageBasedDriver</w:t>
       </w:r>
       <w:proofErr w:type="spellEnd"/>
       <w:r>
         <w:rPr>
           <w:lang w:val="es-AR"/>
         </w:rPr>
-        <w:t>”</w:t>
-      </w:r>
-    </w:p>
-    <w:p>
-      <w:pPr>
-        <w:pStyle w:val="Heading1"/>
-      </w:pPr>
-      <w:r>
-        <w:t>1.</w:t>
-      </w:r>
-      <w:r>
-        <w:t xml:space="preserve"> Herencia:</w:t>
-      </w:r>
-    </w:p>
-    <w:p>
-      <w:pPr>
-        <w:jc w:val="both"/>
-        <w:rPr>
-          <w:lang w:val="es-AR"/>
-        </w:rPr>
-      </w:pPr>
-      <w:r>
-        <w:rPr>
-          <w:lang w:val="es-AR"/>
-        </w:rPr>
-        <w:tab/>
-      </w:r>
-      <w:r>
-        <w:rPr>
-          <w:lang w:val="es-AR"/>
-        </w:rPr>
-        <w:t>Los Drivers que quieren conectarse a través de mensajes tendrían que utilizar de clase base “</w:t>
-      </w:r>
-      <w:proofErr w:type="spellStart"/>
-      <w:r>
-        <w:rPr>
-          <w:lang w:val="es-AR"/>
-        </w:rPr>
-        <w:t>MessageBasedDriver</w:t>
-      </w:r>
-      <w:proofErr w:type="spellEnd"/>
-      <w:r>
-        <w:rPr>
-          <w:lang w:val="es-AR"/>
-        </w:rPr>
         <w:t xml:space="preserve">”, que ofrece una </w:t>
       </w:r>
       <w:r>
@@ -247,14 +219,12 @@
         </w:rPr>
         <w:t xml:space="preserve"> e </w:t>
       </w:r>
-      <w:proofErr w:type="spellStart"/>
-      <w:r>
-        <w:rPr>
-          <w:lang w:val="es-AR"/>
-        </w:rPr>
-        <w:t>utiles</w:t>
-      </w:r>
-      <w:proofErr w:type="spellEnd"/>
+      <w:r>
+        <w:rPr>
+          <w:lang w:val="es-AR"/>
+        </w:rPr>
+        <w:t>útiles</w:t>
+      </w:r>
       <w:r>
         <w:rPr>
           <w:lang w:val="es-AR"/>
@@ -315,99 +285,94 @@
             <v:path o:extrusionok="f" gradientshapeok="t" o:connecttype="rect"/>
             <o:lock v:ext="edit" aspectratio="t"/>
           </v:shapetype>
-          <v:shape id="_x0000_i1039" type="#_x0000_t75" style="width:523.5pt;height:93.75pt" o:ole="">
+          <v:shape id="_x0000_i1025" type="#_x0000_t75" style="width:523.25pt;height:93.75pt" o:ole="">
             <v:imagedata r:id="rId4" o:title=""/>
           </v:shape>
-          <o:OLEObject Type="Embed" ProgID="Word.OpenDocumentText.12" ShapeID="_x0000_i1039" DrawAspect="Content" ObjectID="_1667220441" r:id="rId5"/>
+          <o:OLEObject Type="Embed" ProgID="Word.OpenDocumentText.12" ShapeID="_x0000_i1025" DrawAspect="Content" ObjectID="_1679222705" r:id="rId5"/>
         </w:object>
       </w:r>
     </w:p>
     <w:p>
       <w:pPr>
-        <w:ind w:firstLine="720"/>
-        <w:jc w:val="both"/>
-        <w:rPr>
-          <w:lang w:val="es-AR"/>
-        </w:rPr>
-      </w:pPr>
-      <w:r>
-        <w:rPr>
-          <w:lang w:val="es-AR"/>
-        </w:rPr>
-        <w:t>Los métodos de clase “</w:t>
+        <w:pStyle w:val="Heading1"/>
+      </w:pPr>
+      <w:r>
+        <w:t xml:space="preserve">2. </w:t>
+      </w:r>
+      <w:r>
+        <w:t>Enviar</w:t>
+      </w:r>
+      <w:r>
+        <w:t xml:space="preserve"> Mensajes:</w:t>
+      </w:r>
+    </w:p>
+    <w:p>
+      <w:pPr>
+        <w:jc w:val="both"/>
+        <w:rPr>
+          <w:lang w:val="es-AR"/>
+        </w:rPr>
+      </w:pPr>
+      <w:r>
+        <w:rPr>
+          <w:lang w:val="es-AR"/>
+        </w:rPr>
+        <w:tab/>
+      </w:r>
+      <w:r>
+        <w:rPr>
+          <w:lang w:val="es-AR"/>
+        </w:rPr>
+        <w:t>El envió de mensajes se hace a traces del método “</w:t>
       </w:r>
       <w:proofErr w:type="spellStart"/>
       <w:r>
         <w:rPr>
           <w:lang w:val="es-AR"/>
         </w:rPr>
-        <w:t>via_usb</w:t>
+        <w:t>write</w:t>
       </w:r>
       <w:proofErr w:type="spellEnd"/>
       <w:r>
         <w:rPr>
           <w:lang w:val="es-AR"/>
         </w:rPr>
-        <w:t>”, “</w:t>
-      </w:r>
-      <w:proofErr w:type="spellStart"/>
-      <w:r>
-        <w:rPr>
-          <w:lang w:val="es-AR"/>
-        </w:rPr>
-        <w:t>via_serial</w:t>
-      </w:r>
-      <w:proofErr w:type="spellEnd"/>
-      <w:r>
-        <w:rPr>
-          <w:lang w:val="es-AR"/>
-        </w:rPr>
-        <w:t>”, “</w:t>
-      </w:r>
-      <w:proofErr w:type="spellStart"/>
-      <w:r>
-        <w:rPr>
-          <w:lang w:val="es-AR"/>
-        </w:rPr>
-        <w:t>via_tcpip</w:t>
-      </w:r>
-      <w:proofErr w:type="spellEnd"/>
-      <w:r>
-        <w:rPr>
-          <w:lang w:val="es-AR"/>
-        </w:rPr>
-        <w:t>” y “</w:t>
-      </w:r>
-      <w:proofErr w:type="spellStart"/>
-      <w:r>
-        <w:rPr>
-          <w:lang w:val="es-AR"/>
-        </w:rPr>
-        <w:t>via_gpib</w:t>
-      </w:r>
-      <w:proofErr w:type="spellEnd"/>
-      <w:r>
-        <w:rPr>
-          <w:lang w:val="es-AR"/>
-        </w:rPr>
-        <w:t>” son los métodos que permiten crear un driver con el tipo de conexión indicado. Estos métodos toman como parámetro generalmente la dirección donde se encuentra el dispositivo. TCP IP, por ejemplo, toma el IP y el puerto del dispositivo.</w:t>
-      </w:r>
-    </w:p>
-    <w:p>
-      <w:pPr>
-        <w:jc w:val="both"/>
-        <w:rPr>
-          <w:lang w:val="es-AR"/>
-        </w:rPr>
-      </w:pPr>
-      <w:r>
-        <w:rPr>
-          <w:lang w:val="es-AR"/>
-        </w:rPr>
-        <w:t>Ej. de uso:</w:t>
-      </w:r>
-    </w:p>
-    <w:bookmarkStart w:id="1" w:name="_MON_1667203292"/>
+        <w:t>” presente en la clase. Este método es</w:t>
+      </w:r>
+      <w:r>
+        <w:rPr>
+          <w:lang w:val="es-AR"/>
+        </w:rPr>
+        <w:t>cribe el mensaje en el canal de</w:t>
+      </w:r>
+      <w:r>
+        <w:rPr>
+          <w:lang w:val="es-AR"/>
+        </w:rPr>
+        <w:t xml:space="preserve"> </w:t>
+      </w:r>
+      <w:r>
+        <w:rPr>
+          <w:lang w:val="es-AR"/>
+        </w:rPr>
+        <w:t xml:space="preserve">comunicación con el driver, y devuelve la cantidad de bytes que se escribieron. Esto se usaría en los casos donde es necesario solo escribir algo y no importa la respuesta. </w:t>
+      </w:r>
+    </w:p>
+    <w:p>
+      <w:pPr>
+        <w:jc w:val="both"/>
+        <w:rPr>
+          <w:lang w:val="es-AR"/>
+        </w:rPr>
+      </w:pPr>
+      <w:r>
+        <w:rPr>
+          <w:lang w:val="es-AR"/>
+        </w:rPr>
+        <w:t>Ejemplo de uso en el driver sdg5122:</w:t>
+      </w:r>
+    </w:p>
+    <w:bookmarkStart w:id="1" w:name="_MON_1667207691"/>
     <w:bookmarkEnd w:id="1"/>
     <w:p>
       <w:pPr>
@@ -420,16 +385,24 @@
         <w:rPr>
           <w:lang w:val="es-AR"/>
         </w:rPr>
-        <w:object w:dxaOrig="10467" w:dyaOrig="468" w14:anchorId="468E6CC4">
-          <v:shape id="_x0000_i1037" type="#_x0000_t75" style="width:523.5pt;height:23.25pt" o:ole="">
+        <w:object w:dxaOrig="10467" w:dyaOrig="1874" w14:anchorId="6726DEF1">
+          <v:shape id="_x0000_i1027" type="#_x0000_t75" style="width:523.25pt;height:93.75pt" o:ole="">
             <v:imagedata r:id="rId6" o:title=""/>
           </v:shape>
-          <o:OLEObject Type="Embed" ProgID="Word.OpenDocumentText.12" ShapeID="_x0000_i1037" DrawAspect="Content" ObjectID="_1667220442" r:id="rId7"/>
+          <o:OLEObject Type="Embed" ProgID="Word.OpenDocumentText.12" ShapeID="_x0000_i1027" DrawAspect="Content" ObjectID="_1679222706" r:id="rId7"/>
         </w:object>
       </w:r>
     </w:p>
     <w:p>
       <w:pPr>
+        <w:pStyle w:val="Heading1"/>
+      </w:pPr>
+      <w:r>
+        <w:t>3. Recibir Mensajes:</w:t>
+      </w:r>
+    </w:p>
+    <w:p>
+      <w:pPr>
         <w:jc w:val="both"/>
         <w:rPr>
           <w:lang w:val="es-AR"/>
@@ -440,13 +413,366 @@
           <w:lang w:val="es-AR"/>
         </w:rPr>
         <w:tab/>
-        <w:t xml:space="preserve">El </w:t>
-      </w:r>
-      <w:r>
-        <w:rPr>
-          <w:lang w:val="es-AR"/>
-        </w:rPr>
-        <w:t>método para inicializar el driver es el segundo “</w:t>
+      </w:r>
+      <w:proofErr w:type="spellStart"/>
+      <w:r>
+        <w:rPr>
+          <w:lang w:val="es-AR"/>
+        </w:rPr>
+        <w:t>El</w:t>
+      </w:r>
+      <w:proofErr w:type="spellEnd"/>
+      <w:r>
+        <w:rPr>
+          <w:lang w:val="es-AR"/>
+        </w:rPr>
+        <w:t xml:space="preserve"> </w:t>
+      </w:r>
+      <w:r>
+        <w:rPr>
+          <w:lang w:val="es-AR"/>
+        </w:rPr>
+        <w:t>envió</w:t>
+      </w:r>
+      <w:r>
+        <w:rPr>
+          <w:lang w:val="es-AR"/>
+        </w:rPr>
+        <w:t xml:space="preserve"> de mensajes</w:t>
+      </w:r>
+      <w:r>
+        <w:rPr>
+          <w:lang w:val="es-AR"/>
+        </w:rPr>
+        <w:t xml:space="preserve"> se hace a través del método “</w:t>
+      </w:r>
+      <w:proofErr w:type="spellStart"/>
+      <w:r>
+        <w:rPr>
+          <w:lang w:val="es-AR"/>
+        </w:rPr>
+        <w:t>read</w:t>
+      </w:r>
+      <w:proofErr w:type="spellEnd"/>
+      <w:r>
+        <w:rPr>
+          <w:lang w:val="es-AR"/>
+        </w:rPr>
+        <w:t>”. Este método lee el buffer hasta el punto</w:t>
+      </w:r>
+      <w:r>
+        <w:rPr>
+          <w:lang w:val="es-AR"/>
+        </w:rPr>
+        <w:t xml:space="preserve"> de leer el byte de finalizacion</w:t>
+      </w:r>
+      <w:r>
+        <w:rPr>
+          <w:vertAlign w:val="superscript"/>
+          <w:lang w:val="es-AR"/>
+        </w:rPr>
+        <w:t>1</w:t>
+      </w:r>
+      <w:r>
+        <w:rPr>
+          <w:lang w:val="es-AR"/>
+        </w:rPr>
+        <w:t xml:space="preserve">. Este método se usa en casos donde hay un mensaje que </w:t>
+      </w:r>
+      <w:proofErr w:type="spellStart"/>
+      <w:r>
+        <w:rPr>
+          <w:lang w:val="es-AR"/>
+        </w:rPr>
+        <w:t>esta</w:t>
+      </w:r>
+      <w:proofErr w:type="spellEnd"/>
+      <w:r>
+        <w:rPr>
+          <w:lang w:val="es-AR"/>
+        </w:rPr>
+        <w:t xml:space="preserve"> esperando en la cola del dispositivo.</w:t>
+      </w:r>
+      <w:r>
+        <w:rPr>
+          <w:lang w:val="es-AR"/>
+        </w:rPr>
+        <w:t xml:space="preserve"> En general esto es útil después de escribir un mensaje que hace al dispositivo escribir una respuesta.</w:t>
+      </w:r>
+      <w:r>
+        <w:rPr>
+          <w:lang w:val="es-AR"/>
+        </w:rPr>
+        <w:t xml:space="preserve"> Este método es usado en el método “</w:t>
+      </w:r>
+      <w:proofErr w:type="spellStart"/>
+      <w:r>
+        <w:rPr>
+          <w:lang w:val="es-AR"/>
+        </w:rPr>
+        <w:t>query</w:t>
+      </w:r>
+      <w:proofErr w:type="spellEnd"/>
+      <w:r>
+        <w:rPr>
+          <w:lang w:val="es-AR"/>
+        </w:rPr>
+        <w:t>”, que primero hace un “</w:t>
+      </w:r>
+      <w:proofErr w:type="spellStart"/>
+      <w:r>
+        <w:rPr>
+          <w:lang w:val="es-AR"/>
+        </w:rPr>
+        <w:t>write</w:t>
+      </w:r>
+      <w:proofErr w:type="spellEnd"/>
+      <w:r>
+        <w:rPr>
+          <w:lang w:val="es-AR"/>
+        </w:rPr>
+        <w:t>” y después lee la respuesta.</w:t>
+      </w:r>
+    </w:p>
+    <w:p>
+      <w:pPr>
+        <w:jc w:val="both"/>
+        <w:rPr>
+          <w:lang w:val="es-AR"/>
+        </w:rPr>
+      </w:pPr>
+      <w:r>
+        <w:rPr>
+          <w:lang w:val="es-AR"/>
+        </w:rPr>
+        <w:t>Código de “</w:t>
+      </w:r>
+      <w:proofErr w:type="spellStart"/>
+      <w:r>
+        <w:rPr>
+          <w:lang w:val="es-AR"/>
+        </w:rPr>
+        <w:t>query</w:t>
+      </w:r>
+      <w:proofErr w:type="spellEnd"/>
+      <w:r>
+        <w:rPr>
+          <w:lang w:val="es-AR"/>
+        </w:rPr>
+        <w:t>” en la librería Lantz:</w:t>
+      </w:r>
+    </w:p>
+    <w:bookmarkStart w:id="2" w:name="_MON_1667215174"/>
+    <w:bookmarkEnd w:id="2"/>
+    <w:p>
+      <w:pPr>
+        <w:jc w:val="both"/>
+        <w:rPr>
+          <w:lang w:val="es-AR"/>
+        </w:rPr>
+      </w:pPr>
+      <w:r>
+        <w:rPr>
+          <w:lang w:val="es-AR"/>
+        </w:rPr>
+        <w:object w:dxaOrig="10467" w:dyaOrig="3513" w14:anchorId="485F854E">
+          <v:shape id="_x0000_i1028" type="#_x0000_t75" style="width:523.25pt;height:175.8pt" o:ole="">
+            <v:imagedata r:id="rId8" o:title=""/>
+          </v:shape>
+          <o:OLEObject Type="Embed" ProgID="Word.OpenDocumentText.12" ShapeID="_x0000_i1028" DrawAspect="Content" ObjectID="_1679222707" r:id="rId9"/>
+        </w:object>
+      </w:r>
+    </w:p>
+    <w:p>
+      <w:pPr>
+        <w:jc w:val="both"/>
+        <w:rPr>
+          <w:lang w:val="es-AR"/>
+        </w:rPr>
+      </w:pPr>
+      <w:r>
+        <w:rPr>
+          <w:lang w:val="es-AR"/>
+        </w:rPr>
+        <w:t xml:space="preserve">Ejemplo de uso del </w:t>
+      </w:r>
+      <w:r>
+        <w:rPr>
+          <w:lang w:val="es-AR"/>
+        </w:rPr>
+        <w:t>“</w:t>
+      </w:r>
+      <w:proofErr w:type="spellStart"/>
+      <w:r>
+        <w:rPr>
+          <w:lang w:val="es-AR"/>
+        </w:rPr>
+        <w:t>query</w:t>
+      </w:r>
+      <w:proofErr w:type="spellEnd"/>
+      <w:r>
+        <w:rPr>
+          <w:lang w:val="es-AR"/>
+        </w:rPr>
+        <w:t>”</w:t>
+      </w:r>
+      <w:r>
+        <w:rPr>
+          <w:lang w:val="es-AR"/>
+        </w:rPr>
+        <w:t xml:space="preserve"> para leer una entrada:</w:t>
+      </w:r>
+    </w:p>
+    <w:bookmarkStart w:id="3" w:name="_GoBack"/>
+    <w:bookmarkStart w:id="4" w:name="_MON_1667219266"/>
+    <w:bookmarkEnd w:id="4"/>
+    <w:p>
+      <w:pPr>
+        <w:jc w:val="both"/>
+        <w:rPr>
+          <w:lang w:val="en-US"/>
+        </w:rPr>
+      </w:pPr>
+      <w:r>
+        <w:rPr>
+          <w:lang w:val="en-US"/>
+        </w:rPr>
+        <w:object w:dxaOrig="10467" w:dyaOrig="2140" w14:anchorId="36C95C51">
+          <v:shape id="_x0000_i1029" type="#_x0000_t75" style="width:523.25pt;height:107.15pt" o:ole="">
+            <v:imagedata r:id="rId10" o:title=""/>
+          </v:shape>
+          <o:OLEObject Type="Embed" ProgID="Word.OpenDocumentText.12" ShapeID="_x0000_i1029" DrawAspect="Content" ObjectID="_1679222708" r:id="rId11"/>
+        </w:object>
+      </w:r>
+      <w:bookmarkEnd w:id="3"/>
+    </w:p>
+    <w:p>
+      <w:pPr>
+        <w:pStyle w:val="Heading1"/>
+      </w:pPr>
+      <w:r>
+        <w:t>4. Instanciar las clases</w:t>
+      </w:r>
+    </w:p>
+    <w:p>
+      <w:pPr>
+        <w:ind w:firstLine="720"/>
+        <w:jc w:val="both"/>
+        <w:rPr>
+          <w:lang w:val="es-AR"/>
+        </w:rPr>
+      </w:pPr>
+      <w:r>
+        <w:rPr>
+          <w:lang w:val="es-AR"/>
+        </w:rPr>
+        <w:t>Los métodos de clase “</w:t>
+      </w:r>
+      <w:proofErr w:type="spellStart"/>
+      <w:r>
+        <w:rPr>
+          <w:lang w:val="es-AR"/>
+        </w:rPr>
+        <w:t>via_usb</w:t>
+      </w:r>
+      <w:proofErr w:type="spellEnd"/>
+      <w:r>
+        <w:rPr>
+          <w:lang w:val="es-AR"/>
+        </w:rPr>
+        <w:t>”, “</w:t>
+      </w:r>
+      <w:proofErr w:type="spellStart"/>
+      <w:r>
+        <w:rPr>
+          <w:lang w:val="es-AR"/>
+        </w:rPr>
+        <w:t>via_serial</w:t>
+      </w:r>
+      <w:proofErr w:type="spellEnd"/>
+      <w:r>
+        <w:rPr>
+          <w:lang w:val="es-AR"/>
+        </w:rPr>
+        <w:t>”, “</w:t>
+      </w:r>
+      <w:proofErr w:type="spellStart"/>
+      <w:r>
+        <w:rPr>
+          <w:lang w:val="es-AR"/>
+        </w:rPr>
+        <w:t>via_tcpip</w:t>
+      </w:r>
+      <w:proofErr w:type="spellEnd"/>
+      <w:r>
+        <w:rPr>
+          <w:lang w:val="es-AR"/>
+        </w:rPr>
+        <w:t>” y “</w:t>
+      </w:r>
+      <w:proofErr w:type="spellStart"/>
+      <w:r>
+        <w:rPr>
+          <w:lang w:val="es-AR"/>
+        </w:rPr>
+        <w:t>via_gpib</w:t>
+      </w:r>
+      <w:proofErr w:type="spellEnd"/>
+      <w:r>
+        <w:rPr>
+          <w:lang w:val="es-AR"/>
+        </w:rPr>
+        <w:t>” son los métodos que permiten crear un driver con el tipo de conexión indicado. Estos métodos toman como parámetro generalmente la dirección donde se encuentra el dispositivo. TCP IP, por ejemplo, toma el IP y el puerto del dispositivo.</w:t>
+      </w:r>
+    </w:p>
+    <w:p>
+      <w:pPr>
+        <w:jc w:val="both"/>
+        <w:rPr>
+          <w:lang w:val="es-AR"/>
+        </w:rPr>
+      </w:pPr>
+      <w:r>
+        <w:rPr>
+          <w:lang w:val="es-AR"/>
+        </w:rPr>
+        <w:t>Ej. de uso:</w:t>
+      </w:r>
+    </w:p>
+    <w:bookmarkStart w:id="5" w:name="_MON_1667203292"/>
+    <w:bookmarkEnd w:id="5"/>
+    <w:p>
+      <w:pPr>
+        <w:jc w:val="both"/>
+        <w:rPr>
+          <w:lang w:val="es-AR"/>
+        </w:rPr>
+      </w:pPr>
+      <w:r>
+        <w:rPr>
+          <w:lang w:val="es-AR"/>
+        </w:rPr>
+        <w:object w:dxaOrig="10467" w:dyaOrig="468" w14:anchorId="4F23CB9B">
+          <v:shape id="_x0000_i1038" type="#_x0000_t75" style="width:523.25pt;height:23.45pt" o:ole="">
+            <v:imagedata r:id="rId12" o:title=""/>
+          </v:shape>
+          <o:OLEObject Type="Embed" ProgID="Word.OpenDocumentText.12" ShapeID="_x0000_i1038" DrawAspect="Content" ObjectID="_1679222709" r:id="rId13"/>
+        </w:object>
+      </w:r>
+    </w:p>
+    <w:p>
+      <w:pPr>
+        <w:jc w:val="both"/>
+        <w:rPr>
+          <w:lang w:val="es-AR"/>
+        </w:rPr>
+      </w:pPr>
+      <w:r>
+        <w:rPr>
+          <w:lang w:val="es-AR"/>
+        </w:rPr>
+        <w:tab/>
+        <w:t>El método para inicializar el driver es el segundo “</w:t>
       </w:r>
       <w:proofErr w:type="spellStart"/>
       <w:proofErr w:type="gramStart"/>
@@ -468,32 +794,11 @@
         <w:rPr>
           <w:lang w:val="es-AR"/>
         </w:rPr>
-        <w:t>)</w:t>
-      </w:r>
-      <w:r>
-        <w:rPr>
-          <w:lang w:val="es-AR"/>
-        </w:rPr>
-        <w:t>” esto asegura que se conecte correctamente el driver al dispositivo y avisa si hay algún problema en la conexión.</w:t>
-      </w:r>
-    </w:p>
-    <w:p>
-      <w:pPr>
-        <w:pStyle w:val="Heading1"/>
-      </w:pPr>
-      <w:r>
-        <w:t xml:space="preserve">2. </w:t>
-      </w:r>
-      <w:r>
-        <w:t>Enviar</w:t>
-      </w:r>
-      <w:r>
-        <w:t xml:space="preserve"> Mensajes:</w:t>
-      </w:r>
-    </w:p>
-    <w:p>
-      <w:pPr>
-        <w:jc w:val="both"/>
+        <w:t>)” esto asegura que se conecte correctamente el driver al dispositivo y avisa si hay algún problema en la conexión.</w:t>
+      </w:r>
+    </w:p>
+    <w:p>
+      <w:pPr>
         <w:rPr>
           <w:lang w:val="es-AR"/>
         </w:rPr>
@@ -503,345 +808,31 @@
           <w:lang w:val="es-AR"/>
         </w:rPr>
         <w:tab/>
-      </w:r>
-      <w:r>
-        <w:rPr>
-          <w:lang w:val="es-AR"/>
-        </w:rPr>
-        <w:t>El envió de mensajes se hace a traces del método “</w:t>
-      </w:r>
-      <w:proofErr w:type="spellStart"/>
-      <w:r>
-        <w:rPr>
-          <w:lang w:val="es-AR"/>
-        </w:rPr>
-        <w:t>write</w:t>
-      </w:r>
-      <w:proofErr w:type="spellEnd"/>
-      <w:r>
-        <w:rPr>
-          <w:lang w:val="es-AR"/>
-        </w:rPr>
-        <w:t>” presente en la clase. Este método es</w:t>
-      </w:r>
-      <w:r>
-        <w:rPr>
-          <w:lang w:val="es-AR"/>
-        </w:rPr>
-        <w:t>cribe el mensaje en el canal de</w:t>
-      </w:r>
-      <w:r>
-        <w:rPr>
-          <w:lang w:val="es-AR"/>
-        </w:rPr>
-        <w:t xml:space="preserve"> </w:t>
-      </w:r>
-      <w:r>
-        <w:rPr>
-          <w:lang w:val="es-AR"/>
-        </w:rPr>
-        <w:t xml:space="preserve">comunicación con el driver, y devuelve la cantidad de bytes que se escribieron. Esto se usaría en los casos donde es necesario solo escribir algo y no importa la respuesta. </w:t>
-      </w:r>
-    </w:p>
-    <w:p>
-      <w:pPr>
-        <w:jc w:val="both"/>
-        <w:rPr>
-          <w:lang w:val="es-AR"/>
-        </w:rPr>
-      </w:pPr>
-      <w:r>
-        <w:rPr>
-          <w:lang w:val="es-AR"/>
-        </w:rPr>
-        <w:t>Ejemplo de uso en el driver sdg5122:</w:t>
-      </w:r>
-    </w:p>
-    <w:bookmarkStart w:id="2" w:name="_MON_1667207691"/>
-    <w:bookmarkEnd w:id="2"/>
-    <w:p>
-      <w:pPr>
-        <w:jc w:val="both"/>
-        <w:rPr>
-          <w:lang w:val="es-AR"/>
-        </w:rPr>
-      </w:pPr>
-      <w:r>
-        <w:rPr>
-          <w:lang w:val="es-AR"/>
-        </w:rPr>
-        <w:object w:dxaOrig="10467" w:dyaOrig="1874" w14:anchorId="6726DEF1">
-          <v:shape id="_x0000_i1041" type="#_x0000_t75" style="width:523.5pt;height:93.75pt" o:ole="">
-            <v:imagedata r:id="rId8" o:title=""/>
-          </v:shape>
-          <o:OLEObject Type="Embed" ProgID="Word.OpenDocumentText.12" ShapeID="_x0000_i1041" DrawAspect="Content" ObjectID="_1667220443" r:id="rId9"/>
-        </w:object>
-      </w:r>
-    </w:p>
-    <w:p>
-      <w:pPr>
-        <w:pStyle w:val="Heading1"/>
-      </w:pPr>
-      <w:r>
-        <w:lastRenderedPageBreak/>
-        <w:t>3. Recibir Mensajes:</w:t>
-      </w:r>
-    </w:p>
-    <w:p>
-      <w:pPr>
-        <w:jc w:val="both"/>
-        <w:rPr>
-          <w:lang w:val="es-AR"/>
-        </w:rPr>
-      </w:pPr>
-      <w:r>
-        <w:rPr>
-          <w:lang w:val="es-AR"/>
-        </w:rPr>
-        <w:tab/>
-      </w:r>
-      <w:proofErr w:type="spellStart"/>
-      <w:r>
-        <w:rPr>
-          <w:lang w:val="es-AR"/>
-        </w:rPr>
-        <w:t>El</w:t>
-      </w:r>
-      <w:proofErr w:type="spellEnd"/>
-      <w:r>
-        <w:rPr>
-          <w:lang w:val="es-AR"/>
-        </w:rPr>
-        <w:t xml:space="preserve"> </w:t>
-      </w:r>
-      <w:r>
-        <w:rPr>
-          <w:lang w:val="es-AR"/>
-        </w:rPr>
-        <w:t>envió</w:t>
-      </w:r>
-      <w:r>
-        <w:rPr>
-          <w:lang w:val="es-AR"/>
-        </w:rPr>
-        <w:t xml:space="preserve"> de mensajes</w:t>
-      </w:r>
-      <w:r>
-        <w:rPr>
-          <w:lang w:val="es-AR"/>
-        </w:rPr>
-        <w:t xml:space="preserve"> se hace a través del método “</w:t>
-      </w:r>
-      <w:proofErr w:type="spellStart"/>
-      <w:r>
-        <w:rPr>
-          <w:lang w:val="es-AR"/>
-        </w:rPr>
-        <w:t>read</w:t>
-      </w:r>
-      <w:proofErr w:type="spellEnd"/>
-      <w:r>
-        <w:rPr>
-          <w:lang w:val="es-AR"/>
-        </w:rPr>
-        <w:t>”. Este método lee el buffer hasta el punto</w:t>
-      </w:r>
-      <w:r>
-        <w:rPr>
-          <w:lang w:val="es-AR"/>
-        </w:rPr>
-        <w:t xml:space="preserve"> de leer el byte de finalizacion</w:t>
-      </w:r>
-      <w:r>
-        <w:rPr>
-          <w:vertAlign w:val="superscript"/>
-          <w:lang w:val="es-AR"/>
-        </w:rPr>
-        <w:t>1</w:t>
-      </w:r>
-      <w:r>
-        <w:rPr>
-          <w:lang w:val="es-AR"/>
-        </w:rPr>
-        <w:t xml:space="preserve">. Este método se usa en casos donde hay un mensaje que </w:t>
-      </w:r>
-      <w:proofErr w:type="spellStart"/>
-      <w:r>
-        <w:rPr>
-          <w:lang w:val="es-AR"/>
-        </w:rPr>
-        <w:t>esta</w:t>
-      </w:r>
-      <w:proofErr w:type="spellEnd"/>
-      <w:r>
-        <w:rPr>
-          <w:lang w:val="es-AR"/>
-        </w:rPr>
-        <w:t xml:space="preserve"> esperando en la cola del dispositivo.</w:t>
-      </w:r>
-      <w:r>
-        <w:rPr>
-          <w:lang w:val="es-AR"/>
-        </w:rPr>
-        <w:t xml:space="preserve"> En general esto es útil después de escribir un mensaje que hace al dispositivo escribir una respuesta.</w:t>
-      </w:r>
-      <w:r>
-        <w:rPr>
-          <w:lang w:val="es-AR"/>
-        </w:rPr>
-        <w:t xml:space="preserve"> Este método es usado en el método “</w:t>
-      </w:r>
-      <w:proofErr w:type="spellStart"/>
-      <w:r>
-        <w:rPr>
-          <w:lang w:val="es-AR"/>
-        </w:rPr>
-        <w:t>query</w:t>
-      </w:r>
-      <w:proofErr w:type="spellEnd"/>
-      <w:r>
-        <w:rPr>
-          <w:lang w:val="es-AR"/>
-        </w:rPr>
-        <w:t>”, que primero hace un “</w:t>
-      </w:r>
-      <w:proofErr w:type="spellStart"/>
-      <w:r>
-        <w:rPr>
-          <w:lang w:val="es-AR"/>
-        </w:rPr>
-        <w:t>write</w:t>
-      </w:r>
-      <w:proofErr w:type="spellEnd"/>
-      <w:r>
-        <w:rPr>
-          <w:lang w:val="es-AR"/>
-        </w:rPr>
-        <w:t>” y después lee la respuesta.</w:t>
-      </w:r>
-    </w:p>
-    <w:p>
-      <w:pPr>
-        <w:jc w:val="both"/>
-        <w:rPr>
-          <w:lang w:val="es-AR"/>
-        </w:rPr>
-      </w:pPr>
-      <w:r>
-        <w:rPr>
-          <w:lang w:val="es-AR"/>
-        </w:rPr>
-        <w:t>Código de “</w:t>
-      </w:r>
-      <w:proofErr w:type="spellStart"/>
-      <w:r>
-        <w:rPr>
-          <w:lang w:val="es-AR"/>
-        </w:rPr>
-        <w:t>query</w:t>
-      </w:r>
-      <w:proofErr w:type="spellEnd"/>
-      <w:r>
-        <w:rPr>
-          <w:lang w:val="es-AR"/>
-        </w:rPr>
-        <w:t xml:space="preserve">” en la librería </w:t>
-      </w:r>
-      <w:proofErr w:type="spellStart"/>
-      <w:r>
-        <w:rPr>
-          <w:lang w:val="es-AR"/>
-        </w:rPr>
-        <w:t>Lantz</w:t>
-      </w:r>
-      <w:proofErr w:type="spellEnd"/>
-      <w:r>
-        <w:rPr>
-          <w:lang w:val="es-AR"/>
-        </w:rPr>
-        <w:t>:</w:t>
-      </w:r>
-    </w:p>
-    <w:bookmarkStart w:id="3" w:name="_MON_1667215174"/>
-    <w:bookmarkEnd w:id="3"/>
-    <w:p>
-      <w:pPr>
-        <w:jc w:val="both"/>
-        <w:rPr>
-          <w:lang w:val="es-AR"/>
-        </w:rPr>
-      </w:pPr>
-      <w:r>
-        <w:rPr>
-          <w:lang w:val="es-AR"/>
-        </w:rPr>
-        <w:object w:dxaOrig="10467" w:dyaOrig="3513" w14:anchorId="485F854E">
-          <v:shape id="_x0000_i1044" type="#_x0000_t75" style="width:523.5pt;height:175.5pt" o:ole="">
-            <v:imagedata r:id="rId10" o:title=""/>
-          </v:shape>
-          <o:OLEObject Type="Embed" ProgID="Word.OpenDocumentText.12" ShapeID="_x0000_i1044" DrawAspect="Content" ObjectID="_1667220444" r:id="rId11"/>
-        </w:object>
-      </w:r>
-    </w:p>
-    <w:p>
-      <w:pPr>
-        <w:jc w:val="both"/>
-        <w:rPr>
-          <w:lang w:val="es-AR"/>
-        </w:rPr>
-      </w:pPr>
-      <w:r>
-        <w:rPr>
-          <w:lang w:val="es-AR"/>
-        </w:rPr>
-        <w:t xml:space="preserve">Ejemplo de uso del </w:t>
-      </w:r>
-      <w:r>
-        <w:rPr>
-          <w:lang w:val="es-AR"/>
-        </w:rPr>
-        <w:t>“</w:t>
-      </w:r>
-      <w:proofErr w:type="spellStart"/>
-      <w:r>
-        <w:rPr>
-          <w:lang w:val="es-AR"/>
-        </w:rPr>
-        <w:t>query</w:t>
-      </w:r>
-      <w:proofErr w:type="spellEnd"/>
-      <w:r>
-        <w:rPr>
-          <w:lang w:val="es-AR"/>
-        </w:rPr>
-        <w:t>”</w:t>
-      </w:r>
-      <w:r>
-        <w:rPr>
-          <w:lang w:val="es-AR"/>
-        </w:rPr>
-        <w:t xml:space="preserve"> para leer una entrada:</w:t>
-      </w:r>
-    </w:p>
-    <w:bookmarkStart w:id="4" w:name="_MON_1667219266"/>
-    <w:bookmarkEnd w:id="4"/>
-    <w:p>
-      <w:pPr>
-        <w:jc w:val="both"/>
-        <w:rPr>
-          <w:lang w:val="en-US"/>
-        </w:rPr>
-      </w:pPr>
-      <w:r>
-        <w:rPr>
-          <w:lang w:val="en-US"/>
-        </w:rPr>
-        <w:object w:dxaOrig="10467" w:dyaOrig="2140" w14:anchorId="36C95C51">
-          <v:shape id="_x0000_i1047" type="#_x0000_t75" style="width:523.5pt;height:107.25pt" o:ole="">
-            <v:imagedata r:id="rId12" o:title=""/>
-          </v:shape>
-          <o:OLEObject Type="Embed" ProgID="Word.OpenDocumentText.12" ShapeID="_x0000_i1047" DrawAspect="Content" ObjectID="_1667220445" r:id="rId13"/>
-        </w:object>
+        <w:t>Estos métodos internamente usan los atributos “</w:t>
+      </w:r>
+      <w:r>
+        <w:rPr>
+          <w:lang w:val="es-AR"/>
+        </w:rPr>
+        <w:t>MANUFACTURER_ID</w:t>
+      </w:r>
+      <w:r>
+        <w:rPr>
+          <w:lang w:val="es-AR"/>
+        </w:rPr>
+        <w:t>” y “</w:t>
+      </w:r>
+      <w:r>
+        <w:rPr>
+          <w:lang w:val="es-AR"/>
+        </w:rPr>
+        <w:t>MODEL_CODE</w:t>
+      </w:r>
+      <w:r>
+        <w:rPr>
+          <w:lang w:val="es-AR"/>
+        </w:rPr>
+        <w:t>” para tratar de encontrar el aparato en NI-VISA.</w:t>
       </w:r>
     </w:p>
     <w:p>
@@ -865,14 +856,12 @@
         <w:tab/>
         <w:t>Caracteres de terminación: la librería tiene un mecanismo para incluir diferentes caracteres de terminación. Por ejemplo, el generador de funciones SDG</w:t>
       </w:r>
-      <w:proofErr w:type="gramStart"/>
-      <w:r>
-        <w:rPr>
-          <w:lang w:val="es-AR"/>
-        </w:rPr>
-        <w:t>5122  usa</w:t>
-      </w:r>
-      <w:proofErr w:type="gramEnd"/>
+      <w:r>
+        <w:rPr>
+          <w:lang w:val="es-AR"/>
+        </w:rPr>
+        <w:t>5122 usa</w:t>
+      </w:r>
       <w:r>
         <w:rPr>
           <w:lang w:val="es-AR"/>
@@ -880,7 +869,6 @@
         <w:t xml:space="preserve"> el formato SCPI de comandos, que especifica usar el carácter “new line” como terminación. Esto se puede definir en la clase de la siguiente manera:</w:t>
       </w:r>
     </w:p>
-    <w:bookmarkStart w:id="5" w:name="_GoBack"/>
     <w:bookmarkStart w:id="6" w:name="_MON_1667220174"/>
     <w:bookmarkEnd w:id="6"/>
     <w:p>
@@ -894,13 +882,12 @@
           <w:lang w:val="en-US"/>
         </w:rPr>
         <w:object w:dxaOrig="10467" w:dyaOrig="2810" w14:anchorId="671540DE">
-          <v:shape id="_x0000_i1054" type="#_x0000_t75" style="width:523.5pt;height:140.25pt" o:ole="">
+          <v:shape id="_x0000_i1030" type="#_x0000_t75" style="width:523.25pt;height:139.8pt" o:ole="">
             <v:imagedata r:id="rId14" o:title=""/>
           </v:shape>
-          <o:OLEObject Type="Embed" ProgID="Word.OpenDocumentText.12" ShapeID="_x0000_i1054" DrawAspect="Content" ObjectID="_1667220446" r:id="rId15"/>
+          <o:OLEObject Type="Embed" ProgID="Word.OpenDocumentText.12" ShapeID="_x0000_i1030" DrawAspect="Content" ObjectID="_1679222710" r:id="rId15"/>
         </w:object>
       </w:r>
-      <w:bookmarkEnd w:id="5"/>
     </w:p>
     <w:sectPr>
       <w:pgSz w:w="11907" w:h="16840" w:code="9"/>

</xml_diff>